<commit_message>
Clarify TW5 team acceptance and contribution wording
</commit_message>
<xml_diff>
--- a/team_integration_workspace/review/promethean_classification/Special_Dark_TW5_Team_Agent_Record.docx
+++ b/team_integration_workspace/review/promethean_classification/Special_Dark_TW5_Team_Agent_Record.docx
@@ -2133,7 +2133,7 @@
               <w:rPr>
                 <w:sz w:val="17"/>
               </w:rPr>
-              <w:t xml:space="preserve">Seven team cases include posture, hype, component, incremental and course-calibration controls. The positive path is exercised only under a supplied instructor anchor, not independently validated history. Checks establish contracts/integrity and saved-content assertions, not truth, real chart accuracy, independent model reliability or classroom participation.</w:t>
+              <w:t xml:space="preserve">Seven team cases include posture, hype, component, incremental and course-calibration controls. The positive path is exercised only under a supplied instructor anchor, not independently validated history. Checks establish contracts/integrity and saved-content assertions, not truth, real chart accuracy or independent model reliability.</w:t>
             </w:r>
           </w:p>
         </w:tc>
@@ -2381,7 +2381,7 @@
         <w:keepNext/>
       </w:pPr>
       <w:r>
-        <w:t xml:space="preserve">Team acceptance and classroom record</w:t>
+        <w:t xml:space="preserve">Team acceptance and contributions</w:t>
       </w:r>
     </w:p>
     <w:p>
@@ -2389,7 +2389,7 @@
         <w:pStyle w:val="Normal"/>
       </w:pPr>
       <w:r>
-        <w:t xml:space="preserve">Yufei Cai explicitly reported that the team accepted the qualified breakthrough finding, preserved withholding concern and anti-hype safeguard. That later acceptance is recorded separately from the earlier reply that no discussion, team-decision or role record was available. No attendance, individual source verification, invented task assignment or 90 percent in-class completion is asserted. The in-class rubric item cannot be certified from the submitted files.</w:t>
+        <w:t xml:space="preserve">The team has accepted version 1.0, including the qualified breakthrough interpretation, the retained withholding alternative and the safeguard against using long-term significance as adoption approval. The synthesis combines Yufei Cai's scope and measurement cautions, Chutong Wang's sequential gates, Jianbo Sun's controlled comparisons and suppression reasoning, and Minghan Liu's evidence-admissibility rules and incremental counterfactual. The shared handoff includes the specialist, source register, comparison and test records, and repository version.</w:t>
       </w:r>
     </w:p>
     <w:p>
@@ -2424,7 +2424,7 @@
         <w:pStyle w:val="Normal"/>
       </w:pPr>
       <w:r>
-        <w:t xml:space="preserve">Original cases differ, so labels were not ranked as equivalent trials. The common chart-review case and evidence boundaries enable a new qualitative design comparison. The following contributions refer to supplied individual artifacts, not newly claimed classroom roles.</w:t>
+        <w:t xml:space="preserve">Original cases differ, so labels were not ranked as equivalent trials. The common chart-review case and evidence boundaries enable a new qualitative design comparison. The table traces each retained design element to its individual Lab 4 source and explains the necessary revision.</w:t>
       </w:r>
     </w:p>
     <w:tbl>

</xml_diff>